<commit_message>
Renumber v2.32 references by order of appearance.
Move audiometer/audiometry standards to 11–12 so citations no longer jump from 1–10 to 24–25, and fix the glued ISO 7029:2017 citation.

Co-authored-by: Cursor <cursoragent@cursor.com>
</commit_message>
<xml_diff>
--- a/docs/pilot-study/manuscripts/Tables1-3.docx
+++ b/docs/pilot-study/manuscripts/Tables1-3.docx
@@ -75,7 +75,7 @@
           </w:tcPr>
           <w:p>
             <w:r>
-              <w:t>年齢相応11)</w:t>
+              <w:t>年齢相応13)</w:t>
             </w:r>
           </w:p>
         </w:tc>
@@ -107,7 +107,7 @@
           </w:tcPr>
           <w:p>
             <w:r>
-              <w:t>高音障害11,12)</w:t>
+              <w:t>高音障害13,14)</w:t>
             </w:r>
           </w:p>
         </w:tc>
@@ -139,7 +139,7 @@
           </w:tcPr>
           <w:p>
             <w:r>
-              <w:t>C5-dip13,14)</w:t>
+              <w:t>C5-dip15,16)</w:t>
             </w:r>
           </w:p>
         </w:tc>
@@ -171,7 +171,7 @@
           </w:tcPr>
           <w:p>
             <w:r>
-              <w:t>低音優位15)</w:t>
+              <w:t>低音優位17)</w:t>
             </w:r>
           </w:p>
         </w:tc>
@@ -203,7 +203,7 @@
           </w:tcPr>
           <w:p>
             <w:r>
-              <w:t>急性感音難聴16)</w:t>
+              <w:t>急性感音難聴18)</w:t>
             </w:r>
           </w:p>
         </w:tc>
@@ -235,7 +235,7 @@
           </w:tcPr>
           <w:p>
             <w:r>
-              <w:t>一側高度17)</w:t>
+              <w:t>一側高度19)</w:t>
             </w:r>
           </w:p>
         </w:tc>
@@ -267,7 +267,7 @@
           </w:tcPr>
           <w:p>
             <w:r>
-              <w:t>伝音ABG18)</w:t>
+              <w:t>伝音ABG20)</w:t>
             </w:r>
           </w:p>
         </w:tc>
@@ -299,7 +299,7 @@
           </w:tcPr>
           <w:p>
             <w:r>
-              <w:t>急性期に伝音難聴または混合難聴を呈する19)</w:t>
+              <w:t>急性期に伝音難聴または混合難聴を呈する21)</w:t>
             </w:r>
           </w:p>
         </w:tc>
@@ -331,7 +331,7 @@
           </w:tcPr>
           <w:p>
             <w:r>
-              <w:t>Carhart様20–22)</w:t>
+              <w:t>Carhart様22–24)</w:t>
             </w:r>
           </w:p>
         </w:tc>
@@ -363,7 +363,7 @@
           </w:tcPr>
           <w:p>
             <w:r>
-              <w:t>大きなABGを伴う伝音難聴23)</w:t>
+              <w:t>大きなABGを伴う伝音難聴25)</w:t>
             </w:r>
           </w:p>
         </w:tc>

</xml_diff>

<commit_message>
Add ItoKen fixed-case simulator as reference 11 in JAMT v2.35.
Contrast fixed-case Web audiometry practice with rule-based generation in the intro and discussion, and renumber later citations.

Co-authored-by: Cursor <cursoragent@cursor.com>
</commit_message>
<xml_diff>
--- a/docs/pilot-study/manuscripts/Tables1-3.docx
+++ b/docs/pilot-study/manuscripts/Tables1-3.docx
@@ -75,7 +75,7 @@
           </w:tcPr>
           <w:p>
             <w:r>
-              <w:t>年齢相応13)</w:t>
+              <w:t>年齢相応14)</w:t>
             </w:r>
           </w:p>
         </w:tc>
@@ -107,7 +107,7 @@
           </w:tcPr>
           <w:p>
             <w:r>
-              <w:t>高音障害13,14)</w:t>
+              <w:t>高音障害14,15)</w:t>
             </w:r>
           </w:p>
         </w:tc>
@@ -139,7 +139,7 @@
           </w:tcPr>
           <w:p>
             <w:r>
-              <w:t>C5-dip15,16)</w:t>
+              <w:t>C5-dip16,17)</w:t>
             </w:r>
           </w:p>
         </w:tc>
@@ -171,7 +171,7 @@
           </w:tcPr>
           <w:p>
             <w:r>
-              <w:t>低音優位17)</w:t>
+              <w:t>低音優位18)</w:t>
             </w:r>
           </w:p>
         </w:tc>
@@ -203,7 +203,7 @@
           </w:tcPr>
           <w:p>
             <w:r>
-              <w:t>急性感音難聴18)</w:t>
+              <w:t>急性感音難聴19)</w:t>
             </w:r>
           </w:p>
         </w:tc>
@@ -235,7 +235,7 @@
           </w:tcPr>
           <w:p>
             <w:r>
-              <w:t>一側高度19)</w:t>
+              <w:t>一側高度20)</w:t>
             </w:r>
           </w:p>
         </w:tc>
@@ -267,7 +267,7 @@
           </w:tcPr>
           <w:p>
             <w:r>
-              <w:t>伝音ABG20)</w:t>
+              <w:t>伝音ABG21)</w:t>
             </w:r>
           </w:p>
         </w:tc>
@@ -299,7 +299,7 @@
           </w:tcPr>
           <w:p>
             <w:r>
-              <w:t>急性期に伝音難聴または混合難聴を呈する21)</w:t>
+              <w:t>急性期に伝音難聴または混合難聴を呈する22)</w:t>
             </w:r>
           </w:p>
         </w:tc>
@@ -331,7 +331,7 @@
           </w:tcPr>
           <w:p>
             <w:r>
-              <w:t>Carhart様22–24)</w:t>
+              <w:t>Carhart様23–25)</w:t>
             </w:r>
           </w:p>
         </w:tc>
@@ -363,7 +363,7 @@
           </w:tcPr>
           <w:p>
             <w:r>
-              <w:t>大きなABGを伴う伝音難聴25)</w:t>
+              <w:t>大きなABGを伴う伝音難聴26)</w:t>
             </w:r>
           </w:p>
         </w:tc>

</xml_diff>